<commit_message>
Add optional subtopic field to question upload templates
Update saphala_single_question_template_v3.docx and scripts/generate-docx-templates.mjs to include an optional 'Subtopic:' field in specific question examples.

Replit-Commit-Author: Agent
Replit-Commit-Session-Id: 746a8cf9-eee5-4aa3-b53e-95853956a157
Replit-Commit-Checkpoint-Type: full_checkpoint
Replit-Commit-Event-Id: c59b3fe2-4894-4233-b954-7648c8084d05
Replit-Commit-Screenshot-Url: https://storage.googleapis.com/screenshot-production-us-central1/999277e6-b640-4bf4-8437-9ea2b127d433/746a8cf9-eee5-4aa3-b53e-95853956a157/Tfb5AP6
</commit_message>
<xml_diff>
--- a/public/downloads/saphala_single_question_template_v3.docx
+++ b/public/downloads/saphala_single_question_template_v3.docx
@@ -2690,6 +2690,33 @@
                 <w:sz w:val="19"/>
                 <w:szCs w:val="19"/>
               </w:rPr>
+              <w:t xml:space="preserve">Subtopic:</w:t>
+            </w:r>
+            <w:r>
+              <w:rPr>
+                <w:rFonts w:ascii="Courier New" w:cs="Courier New" w:eastAsia="Courier New" w:hAnsi="Courier New"/>
+                <w:color w:val="6B7280"/>
+                <w:sz w:val="19"/>
+                <w:szCs w:val="19"/>
+              </w:rPr>
+              <w:t xml:space="preserve">  Average Speed Problems</w:t>
+            </w:r>
+          </w:p>
+          <w:p>
+            <w:pPr>
+              <w:shd w:fill="FAFAFA" w:val="clear"/>
+              <w:spacing w:after="30" w:before="30"/>
+              <w:ind w:left="431"/>
+            </w:pPr>
+            <w:r>
+              <w:rPr>
+                <w:rFonts w:ascii="Courier New" w:cs="Courier New" w:eastAsia="Courier New" w:hAnsi="Courier New"/>
+                <w:b/>
+                <w:bCs/>
+                <w:color w:val="7C3AED"/>
+                <w:sz w:val="19"/>
+                <w:szCs w:val="19"/>
+              </w:rPr>
               <w:t xml:space="preserve">Explanation:</w:t>
             </w:r>
             <w:r>
@@ -4211,6 +4238,33 @@
                 <w:szCs w:val="19"/>
               </w:rPr>
               <w:t xml:space="preserve">  Number Theory</w:t>
+            </w:r>
+          </w:p>
+          <w:p>
+            <w:pPr>
+              <w:shd w:fill="FAFAFA" w:val="clear"/>
+              <w:spacing w:after="30" w:before="30"/>
+              <w:ind w:left="431"/>
+            </w:pPr>
+            <w:r>
+              <w:rPr>
+                <w:rFonts w:ascii="Courier New" w:cs="Courier New" w:eastAsia="Courier New" w:hAnsi="Courier New"/>
+                <w:b/>
+                <w:bCs/>
+                <w:color w:val="7C3AED"/>
+                <w:sz w:val="19"/>
+                <w:szCs w:val="19"/>
+              </w:rPr>
+              <w:t xml:space="preserve">Subtopic:</w:t>
+            </w:r>
+            <w:r>
+              <w:rPr>
+                <w:rFonts w:ascii="Courier New" w:cs="Courier New" w:eastAsia="Courier New" w:hAnsi="Courier New"/>
+                <w:color w:val="6B7280"/>
+                <w:sz w:val="19"/>
+                <w:szCs w:val="19"/>
+              </w:rPr>
+              <w:t xml:space="preserve">  Prime &amp; Composite Numbers</w:t>
             </w:r>
           </w:p>
           <w:p>

</xml_diff>